<commit_message>
docs(bd): VCH prequalification briefing + dossier update + LMFM inquiry email
Resolves the one open item in the VCH dossier: the LMFM "Pre-Qualified
Professional Engineers" roster. Verified against the live RFPQ26-PE list
(eff. 29 May 2026) - KOR is absent while all named competitors are listed.

- New briefing (exec summary + ACT NOW + verified detail): roster is current
  (annual fall refresh, BC Bid + Bonfire, FMP@fraserhealth.ca), tiered by
  Acute/Non-Acute x fee band; marquee towers go via Infrastructure BC alliance
  (architect/GC teaming), not the list.
- Dossier section 5 rewritten with the concrete portal/cadence/contact/tiers.
- Draft inquiry email to FMP to lock the 2026 refresh dates.
- All three rendered to branded DOCX via tools/Format-BdDocx.ps1.

Co-Authored-By: Claude Opus 4.8 (1M context) <noreply@anthropic.com>
</commit_message>
<xml_diff>
--- a/docs/KOR-VCH-Deep-Analysis-2026-06-23.docx
+++ b/docs/KOR-VCH-Deep-Analysis-2026-06-23.docx
@@ -79,7 +79,7 @@
     </w:p>
     <w:p>
       <w:r>
-        <w:pict w14:anchorId="3BFBD3BB">
+        <w:pict w14:anchorId="18C2CD12">
           <v:rect id="_x0000_i1025" style="width:0;height:1.5pt" o:hralign="center" o:hrstd="t" o:hr="t"/>
         </w:pict>
       </w:r>
@@ -212,7 +212,7 @@
     </w:p>
     <w:p>
       <w:r>
-        <w:pict w14:anchorId="46F68C52">
+        <w:pict w14:anchorId="0441E670">
           <v:rect id="_x0000_i1026" style="width:0;height:1.5pt" o:hralign="center" o:hrstd="t" o:hr="t"/>
         </w:pict>
       </w:r>
@@ -1463,7 +1463,7 @@
     </w:p>
     <w:p>
       <w:r>
-        <w:pict w14:anchorId="7B71F908">
+        <w:pict w14:anchorId="6F320152">
           <v:rect id="_x0000_i1027" style="width:0;height:1.5pt" o:hralign="center" o:hrstd="t" o:hr="t"/>
         </w:pict>
       </w:r>
@@ -1643,7 +1643,7 @@
     </w:p>
     <w:p>
       <w:r>
-        <w:pict w14:anchorId="5E6BA08A">
+        <w:pict w14:anchorId="6C698E30">
           <v:rect id="_x0000_i1028" style="width:0;height:1.5pt" o:hralign="center" o:hrstd="t" o:hr="t"/>
         </w:pict>
       </w:r>
@@ -1992,14 +1992,7 @@
               <w:rPr>
                 <w:sz w:val="19"/>
               </w:rPr>
-              <w:t xml:space="preserve"> Ex-Turner Construction — speaks delivery/structural-</w:t>
-            </w:r>
-            <w:r>
-              <w:rPr>
-                <w:sz w:val="19"/>
-              </w:rPr>
-              <w:lastRenderedPageBreak/>
-              <w:t>package language. Warm intro via Turner if KOR has a connection.</w:t>
+              <w:t xml:space="preserve"> Ex-Turner Construction — speaks delivery/structural-package language. Warm intro via Turner if KOR has a connection.</w:t>
             </w:r>
           </w:p>
         </w:tc>
@@ -2026,7 +2019,6 @@
                 <w:bCs/>
                 <w:sz w:val="19"/>
               </w:rPr>
-              <w:lastRenderedPageBreak/>
               <w:t>Sam Samsami</w:t>
             </w:r>
           </w:p>
@@ -2805,7 +2797,6 @@
                 <w:bCs/>
                 <w:sz w:val="19"/>
               </w:rPr>
-              <w:lastRenderedPageBreak/>
               <w:t>Kristalina Dinovsky-Kutev</w:t>
             </w:r>
           </w:p>
@@ -3514,7 +3505,7 @@
     </w:p>
     <w:p>
       <w:r>
-        <w:pict w14:anchorId="61FAB90E">
+        <w:pict w14:anchorId="2880BAC1">
           <v:rect id="_x0000_i1029" style="width:0;height:1.5pt" o:hralign="center" o:hrstd="t" o:hr="t"/>
         </w:pict>
       </w:r>
@@ -3528,7 +3519,6 @@
       <w:bookmarkEnd w:id="4"/>
       <w:bookmarkEnd w:id="9"/>
       <w:r>
-        <w:lastRenderedPageBreak/>
         <w:t>5. The play (next 2 quarters)</w:t>
       </w:r>
     </w:p>
@@ -3545,10 +3535,172 @@
           <w:b/>
           <w:bCs/>
         </w:rPr>
-        <w:t>Build the first healthcare credit</w:t>
-      </w:r>
-      <w:r>
-        <w:t xml:space="preserve"> — pursue a VCH LTC or a smaller LMFM-prequalified job (via </w:t>
+        <w:t>Get on the LMFM “Pre-Qualified Professional Engineers” list — Structural.</w:t>
+      </w:r>
+      <w:r>
+        <w:t xml:space="preserve"> This is now confirmed and concrete (full detail: </w:t>
+      </w:r>
+      <w:r>
+        <w:rPr>
+          <w:rStyle w:val="VerbatimChar"/>
+        </w:rPr>
+        <w:t>KOR-VCH-Prequalification-Briefing-2026-06-24</w:t>
+      </w:r>
+      <w:r>
+        <w:t xml:space="preserve">). LMFM runs the shared engineering prequal roster for VCH + Fraser Health + PHSA + Providence; the live list is </w:t>
+      </w:r>
+      <w:r>
+        <w:rPr>
+          <w:b/>
+          <w:bCs/>
+        </w:rPr>
+        <w:t>RFPQ26-PE, effective 29 May 2026</w:t>
+      </w:r>
+      <w:r>
+        <w:t xml:space="preserve">, and </w:t>
+      </w:r>
+      <w:r>
+        <w:rPr>
+          <w:b/>
+          <w:bCs/>
+        </w:rPr>
+        <w:t>KOR is not on it</w:t>
+      </w:r>
+      <w:r>
+        <w:t xml:space="preserve"> while every named competitor is (Bush Bohlman, Glotman, RJC, Fast+Epp, Entuitive, DIALOG, Stantec, WSP). Passive BC Bid watching ≠ being on the roster.</w:t>
+      </w:r>
+    </w:p>
+    <w:p>
+      <w:pPr>
+        <w:pStyle w:val="Compact"/>
+        <w:numPr>
+          <w:ilvl w:val="1"/>
+          <w:numId w:val="5"/>
+        </w:numPr>
+      </w:pPr>
+      <w:r>
+        <w:rPr>
+          <w:b/>
+          <w:bCs/>
+        </w:rPr>
+        <w:t>Mechanism:</w:t>
+      </w:r>
+      <w:r>
+        <w:t xml:space="preserve"> annual refresh. The 2025 cycle closed </w:t>
+      </w:r>
+      <w:r>
+        <w:rPr>
+          <w:b/>
+          <w:bCs/>
+        </w:rPr>
+        <w:t>31 Oct 2025</w:t>
+      </w:r>
+      <w:r>
+        <w:t xml:space="preserve"> → list effective 29 May 2026; the </w:t>
+      </w:r>
+      <w:r>
+        <w:rPr>
+          <w:b/>
+          <w:bCs/>
+        </w:rPr>
+        <w:t>2026 refresh should post ~Sept–Oct 2026</w:t>
+      </w:r>
+      <w:r>
+        <w:t xml:space="preserve"> on BC Bid + Bonfire. The refresh is also when listed firms must re-apply, so it’s the universal entry point — </w:t>
+      </w:r>
+      <w:r>
+        <w:rPr>
+          <w:i/>
+          <w:iCs/>
+        </w:rPr>
+        <w:t>watch for it now.</w:t>
+      </w:r>
+    </w:p>
+    <w:p>
+      <w:pPr>
+        <w:pStyle w:val="Compact"/>
+        <w:numPr>
+          <w:ilvl w:val="1"/>
+          <w:numId w:val="5"/>
+        </w:numPr>
+      </w:pPr>
+      <w:r>
+        <w:rPr>
+          <w:b/>
+          <w:bCs/>
+        </w:rPr>
+        <w:t>How to apply:</w:t>
+      </w:r>
+      <w:r>
+        <w:t xml:space="preserve"> monitor BC Bid + the Fraser Health Bonfire portal (</w:t>
+      </w:r>
+      <w:r>
+        <w:rPr>
+          <w:rStyle w:val="VerbatimChar"/>
+        </w:rPr>
+        <w:t>fraserhealth.bonfirehub.ca</w:t>
+      </w:r>
+      <w:r>
+        <w:t xml:space="preserve">); contact </w:t>
+      </w:r>
+      <w:r>
+        <w:rPr>
+          <w:rStyle w:val="VerbatimChar"/>
+          <w:b/>
+          <w:bCs/>
+        </w:rPr>
+        <w:t>FMP@fraserhealth.ca</w:t>
+      </w:r>
+      <w:r>
+        <w:t>.</w:t>
+      </w:r>
+    </w:p>
+    <w:p>
+      <w:pPr>
+        <w:pStyle w:val="Compact"/>
+        <w:numPr>
+          <w:ilvl w:val="1"/>
+          <w:numId w:val="5"/>
+        </w:numPr>
+      </w:pPr>
+      <w:r>
+        <w:rPr>
+          <w:b/>
+          <w:bCs/>
+        </w:rPr>
+        <w:t>Tiers:</w:t>
+      </w:r>
+      <w:r>
+        <w:t xml:space="preserve"> firms qualify cell-by-cell by </w:t>
+      </w:r>
+      <w:r>
+        <w:rPr>
+          <w:b/>
+          <w:bCs/>
+        </w:rPr>
+        <w:t>Acute vs Non-Acute</w:t>
+      </w:r>
+      <w:r>
+        <w:t xml:space="preserve"> × fee band (</w:t>
+      </w:r>
+      <w:r>
+        <w:rPr>
+          <w:rStyle w:val="VerbatimChar"/>
+        </w:rPr>
+        <w:t>&lt;$150K / $150K–1M / $1M–5M / &gt;$5M</w:t>
+      </w:r>
+      <w:r>
+        <w:t xml:space="preserve">). EGBC licensure is the hard gate (KOR clears it). </w:t>
+      </w:r>
+      <w:r>
+        <w:rPr>
+          <w:b/>
+          <w:bCs/>
+        </w:rPr>
+        <w:t>KOR’s realistic entry = Non-Acute + lower fee bands</w:t>
+      </w:r>
+      <w:r>
+        <w:t xml:space="preserve"> (small firms like Equilibrium, Sense, Wicke Herfst Maver sit in just 1–2 cells) — exactly the first-healthcare-credit play, e.g. via </w:t>
       </w:r>
       <w:r>
         <w:rPr>
@@ -3568,17 +3720,7 @@
         <w:t>Mauricio Acosta</w:t>
       </w:r>
       <w:r>
-        <w:t xml:space="preserve">), and verify/secure KOR on the LMFM engineering prequalification list (Fraser Health Bonfire + BC Bid — note: KOR already </w:t>
-      </w:r>
-      <w:r>
-        <w:rPr>
-          <w:i/>
-          <w:iCs/>
-        </w:rPr>
-        <w:t>sees</w:t>
-      </w:r>
-      <w:r>
-        <w:t xml:space="preserve"> these tenders; this is about being on the invited-engineer roster).</w:t>
+        <w:t>.</w:t>
       </w:r>
     </w:p>
     <w:p>
@@ -3688,7 +3830,7 @@
     </w:p>
     <w:p>
       <w:r>
-        <w:pict w14:anchorId="6A9A2FA4">
+        <w:pict w14:anchorId="6D894691">
           <v:rect id="_x0000_i1030" style="width:0;height:1.5pt" o:hralign="center" o:hrstd="t" o:hr="t"/>
         </w:pict>
       </w:r>
@@ -3709,7 +3851,7 @@
         <w:pStyle w:val="Compact"/>
         <w:numPr>
           <w:ilvl w:val="0"/>
-          <w:numId w:val="5"/>
+          <w:numId w:val="6"/>
         </w:numPr>
       </w:pPr>
       <w:r>
@@ -3728,7 +3870,7 @@
         <w:pStyle w:val="Compact"/>
         <w:numPr>
           <w:ilvl w:val="0"/>
-          <w:numId w:val="5"/>
+          <w:numId w:val="6"/>
         </w:numPr>
       </w:pPr>
       <w:r>
@@ -3747,7 +3889,7 @@
         <w:pStyle w:val="Compact"/>
         <w:numPr>
           <w:ilvl w:val="0"/>
-          <w:numId w:val="5"/>
+          <w:numId w:val="6"/>
         </w:numPr>
       </w:pPr>
       <w:r>
@@ -3768,7 +3910,7 @@
         <w:pStyle w:val="Compact"/>
         <w:numPr>
           <w:ilvl w:val="0"/>
-          <w:numId w:val="5"/>
+          <w:numId w:val="6"/>
         </w:numPr>
       </w:pPr>
       <w:r>
@@ -3794,7 +3936,7 @@
   <w:abstractNum w:abstractNumId="0" w15:restartNumberingAfterBreak="0">
     <w:nsid w:val="0000A990"/>
     <w:multiLevelType w:val="multilevel"/>
-    <w:tmpl w:val="01D6E6E0"/>
+    <w:tmpl w:val="A67E97F0"/>
     <w:lvl w:ilvl="0">
       <w:numFmt w:val="bullet"/>
       <w:lvlText w:val=" "/>
@@ -3871,7 +4013,7 @@
   <w:abstractNum w:abstractNumId="1" w15:restartNumberingAfterBreak="0">
     <w:nsid w:val="0000A991"/>
     <w:multiLevelType w:val="multilevel"/>
-    <w:tmpl w:val="835E1830"/>
+    <w:tmpl w:val="DD6AD716"/>
     <w:lvl w:ilvl="0">
       <w:numFmt w:val="bullet"/>
       <w:lvlText w:val=""/>
@@ -3975,7 +4117,7 @@
   <w:abstractNum w:abstractNumId="2" w15:restartNumberingAfterBreak="0">
     <w:nsid w:val="00A99411"/>
     <w:multiLevelType w:val="multilevel"/>
-    <w:tmpl w:val="9050F71E"/>
+    <w:tmpl w:val="CD441ED6"/>
     <w:lvl w:ilvl="0">
       <w:start w:val="1"/>
       <w:numFmt w:val="decimal"/>
@@ -4058,16 +4200,16 @@
       </w:pPr>
     </w:lvl>
   </w:abstractNum>
-  <w:num w:numId="1" w16cid:durableId="1932005736">
+  <w:num w:numId="1" w16cid:durableId="379016882">
     <w:abstractNumId w:val="0"/>
   </w:num>
-  <w:num w:numId="2" w16cid:durableId="413474776">
+  <w:num w:numId="2" w16cid:durableId="1409114729">
     <w:abstractNumId w:val="1"/>
   </w:num>
-  <w:num w:numId="3" w16cid:durableId="916939091">
+  <w:num w:numId="3" w16cid:durableId="777337232">
     <w:abstractNumId w:val="1"/>
   </w:num>
-  <w:num w:numId="4" w16cid:durableId="891186791">
+  <w:num w:numId="4" w16cid:durableId="1956598765">
     <w:abstractNumId w:val="2"/>
     <w:lvlOverride w:ilvl="0">
       <w:startOverride w:val="1"/>
@@ -4097,7 +4239,10 @@
       <w:startOverride w:val="1"/>
     </w:lvlOverride>
   </w:num>
-  <w:num w:numId="5" w16cid:durableId="1717043715">
+  <w:num w:numId="5" w16cid:durableId="1790657316">
+    <w:abstractNumId w:val="1"/>
+  </w:num>
+  <w:num w:numId="6" w16cid:durableId="1363819082">
     <w:abstractNumId w:val="1"/>
   </w:num>
 </w:numbering>
@@ -5332,7 +5477,7 @@
     <w:name w:val="Grid Table 4"/>
     <w:basedOn w:val="TableNormal"/>
     <w:uiPriority w:val="49"/>
-    <w:rsid w:val="0036274C"/>
+    <w:rsid w:val="00580191"/>
     <w:pPr>
       <w:spacing w:after="0"/>
     </w:pPr>

</xml_diff>